<commit_message>
Add charts to report and filter ADO to New/In Progress/Awaiting Deployment
- Pendo: visitor activity bar chart + top pages horizontal bar chart
- ADO: state donut chart + priority bar chart, side-by-side per section
- ADO WIQL query now filters to New, In Progress, Awaiting Deployment only

Co-Authored-By: Claude Sonnet 4.6 <noreply@anthropic.com>
Claude-Session: https://claude.ai/code/session_013r2bkB7djMAD1MNGbK3EL3
</commit_message>
<xml_diff>
--- a/Blackstone_Scrum_20260617.docx
+++ b/Blackstone_Scrum_20260617.docx
@@ -31,7 +31,7 @@
           <w:color w:val="757575"/>
           <w:sz w:val="18"/>
         </w:rPr>
-        <w:t>Wednesday, June 17, 2026   ·   Report generated 11:34 PM IST</w:t>
+        <w:t>Wednesday, June 17, 2026   ·   Report generated 11:41 PM IST</w:t>
       </w:r>
     </w:p>
     <w:p>
@@ -1616,6 +1616,105 @@
       </w:tr>
     </w:tbl>
     <w:p/>
+    <w:tbl>
+      <w:tblPr>
+        <w:tblStyle w:val="TableGrid"/>
+        <w:tblW w:type="auto" w:w="0"/>
+        <w:jc w:val="left"/>
+        <w:tblLook w:firstColumn="1" w:firstRow="1" w:lastColumn="0" w:lastRow="0" w:noHBand="0" w:noVBand="1" w:val="04A0"/>
+      </w:tblPr>
+      <w:tblGrid>
+        <w:gridCol w:w="5100"/>
+        <w:gridCol w:w="5100"/>
+      </w:tblGrid>
+      <w:tr>
+        <w:tc>
+          <w:tcPr>
+            <w:tcW w:type="dxa" w:w="4896"/>
+            <w:shd w:val="clear" w:color="auto" w:fill="FFFFFF"/>
+          </w:tcPr>
+          <w:p>
+            <w:r>
+              <w:drawing>
+                <wp:inline xmlns:a="http://schemas.openxmlformats.org/drawingml/2006/main" xmlns:pic="http://schemas.openxmlformats.org/drawingml/2006/picture">
+                  <wp:extent cx="3017520" cy="2387148"/>
+                  <wp:docPr id="1" name="Picture 1"/>
+                  <wp:cNvGraphicFramePr>
+                    <a:graphicFrameLocks noChangeAspect="1"/>
+                  </wp:cNvGraphicFramePr>
+                  <a:graphic>
+                    <a:graphicData uri="http://schemas.openxmlformats.org/drawingml/2006/picture">
+                      <pic:pic>
+                        <pic:nvPicPr>
+                          <pic:cNvPr id="0" name="image.png"/>
+                          <pic:cNvPicPr/>
+                        </pic:nvPicPr>
+                        <pic:blipFill>
+                          <a:blip r:embed="rId9"/>
+                          <a:stretch>
+                            <a:fillRect/>
+                          </a:stretch>
+                        </pic:blipFill>
+                        <pic:spPr>
+                          <a:xfrm>
+                            <a:off x="0" y="0"/>
+                            <a:ext cx="3017520" cy="2387148"/>
+                          </a:xfrm>
+                          <a:prstGeom prst="rect"/>
+                        </pic:spPr>
+                      </pic:pic>
+                    </a:graphicData>
+                  </a:graphic>
+                </wp:inline>
+              </w:drawing>
+            </w:r>
+          </w:p>
+        </w:tc>
+        <w:tc>
+          <w:tcPr>
+            <w:tcW w:type="dxa" w:w="4896"/>
+            <w:shd w:val="clear" w:color="auto" w:fill="FFFFFF"/>
+          </w:tcPr>
+          <w:p>
+            <w:r>
+              <w:drawing>
+                <wp:inline xmlns:a="http://schemas.openxmlformats.org/drawingml/2006/main" xmlns:pic="http://schemas.openxmlformats.org/drawingml/2006/picture">
+                  <wp:extent cx="3017520" cy="1563624"/>
+                  <wp:docPr id="2" name="Picture 2"/>
+                  <wp:cNvGraphicFramePr>
+                    <a:graphicFrameLocks noChangeAspect="1"/>
+                  </wp:cNvGraphicFramePr>
+                  <a:graphic>
+                    <a:graphicData uri="http://schemas.openxmlformats.org/drawingml/2006/picture">
+                      <pic:pic>
+                        <pic:nvPicPr>
+                          <pic:cNvPr id="0" name="image.png"/>
+                          <pic:cNvPicPr/>
+                        </pic:nvPicPr>
+                        <pic:blipFill>
+                          <a:blip r:embed="rId10"/>
+                          <a:stretch>
+                            <a:fillRect/>
+                          </a:stretch>
+                        </pic:blipFill>
+                        <pic:spPr>
+                          <a:xfrm>
+                            <a:off x="0" y="0"/>
+                            <a:ext cx="3017520" cy="1563624"/>
+                          </a:xfrm>
+                          <a:prstGeom prst="rect"/>
+                        </pic:spPr>
+                      </pic:pic>
+                    </a:graphicData>
+                  </a:graphic>
+                </wp:inline>
+              </w:drawing>
+            </w:r>
+          </w:p>
+        </w:tc>
+      </w:tr>
+    </w:tbl>
+    <w:p/>
     <w:p>
       <w:pPr>
         <w:spacing w:before="200" w:after="40"/>
@@ -2386,7 +2485,7 @@
                 <w:i w:val="0"/>
                 <w:sz w:val="18"/>
               </w:rPr>
-              <w:t>Active</w:t>
+              <w:t>New</w:t>
             </w:r>
           </w:p>
         </w:tc>
@@ -2514,7 +2613,7 @@
                 <w:i w:val="0"/>
                 <w:sz w:val="18"/>
               </w:rPr>
-              <w:t>Active</w:t>
+              <w:t>Awaiting Deployment</w:t>
             </w:r>
           </w:p>
         </w:tc>
@@ -2533,6 +2632,105 @@
                 <w:sz w:val="18"/>
               </w:rPr>
               <w:t>Bug</w:t>
+            </w:r>
+          </w:p>
+        </w:tc>
+      </w:tr>
+    </w:tbl>
+    <w:p/>
+    <w:tbl>
+      <w:tblPr>
+        <w:tblStyle w:val="TableGrid"/>
+        <w:tblW w:type="auto" w:w="0"/>
+        <w:jc w:val="left"/>
+        <w:tblLook w:firstColumn="1" w:firstRow="1" w:lastColumn="0" w:lastRow="0" w:noHBand="0" w:noVBand="1" w:val="04A0"/>
+      </w:tblPr>
+      <w:tblGrid>
+        <w:gridCol w:w="5100"/>
+        <w:gridCol w:w="5100"/>
+      </w:tblGrid>
+      <w:tr>
+        <w:tc>
+          <w:tcPr>
+            <w:tcW w:type="dxa" w:w="4896"/>
+            <w:shd w:val="clear" w:color="auto" w:fill="FFFFFF"/>
+          </w:tcPr>
+          <w:p>
+            <w:r>
+              <w:drawing>
+                <wp:inline xmlns:a="http://schemas.openxmlformats.org/drawingml/2006/main" xmlns:pic="http://schemas.openxmlformats.org/drawingml/2006/picture">
+                  <wp:extent cx="3017520" cy="2024915"/>
+                  <wp:docPr id="3" name="Picture 3"/>
+                  <wp:cNvGraphicFramePr>
+                    <a:graphicFrameLocks noChangeAspect="1"/>
+                  </wp:cNvGraphicFramePr>
+                  <a:graphic>
+                    <a:graphicData uri="http://schemas.openxmlformats.org/drawingml/2006/picture">
+                      <pic:pic>
+                        <pic:nvPicPr>
+                          <pic:cNvPr id="0" name="image.png"/>
+                          <pic:cNvPicPr/>
+                        </pic:nvPicPr>
+                        <pic:blipFill>
+                          <a:blip r:embed="rId11"/>
+                          <a:stretch>
+                            <a:fillRect/>
+                          </a:stretch>
+                        </pic:blipFill>
+                        <pic:spPr>
+                          <a:xfrm>
+                            <a:off x="0" y="0"/>
+                            <a:ext cx="3017520" cy="2024915"/>
+                          </a:xfrm>
+                          <a:prstGeom prst="rect"/>
+                        </pic:spPr>
+                      </pic:pic>
+                    </a:graphicData>
+                  </a:graphic>
+                </wp:inline>
+              </w:drawing>
+            </w:r>
+          </w:p>
+        </w:tc>
+        <w:tc>
+          <w:tcPr>
+            <w:tcW w:type="dxa" w:w="4896"/>
+            <w:shd w:val="clear" w:color="auto" w:fill="FFFFFF"/>
+          </w:tcPr>
+          <w:p>
+            <w:r>
+              <w:drawing>
+                <wp:inline xmlns:a="http://schemas.openxmlformats.org/drawingml/2006/main" xmlns:pic="http://schemas.openxmlformats.org/drawingml/2006/picture">
+                  <wp:extent cx="3017520" cy="2126502"/>
+                  <wp:docPr id="4" name="Picture 4"/>
+                  <wp:cNvGraphicFramePr>
+                    <a:graphicFrameLocks noChangeAspect="1"/>
+                  </wp:cNvGraphicFramePr>
+                  <a:graphic>
+                    <a:graphicData uri="http://schemas.openxmlformats.org/drawingml/2006/picture">
+                      <pic:pic>
+                        <pic:nvPicPr>
+                          <pic:cNvPr id="0" name="image.png"/>
+                          <pic:cNvPicPr/>
+                        </pic:nvPicPr>
+                        <pic:blipFill>
+                          <a:blip r:embed="rId12"/>
+                          <a:stretch>
+                            <a:fillRect/>
+                          </a:stretch>
+                        </pic:blipFill>
+                        <pic:spPr>
+                          <a:xfrm>
+                            <a:off x="0" y="0"/>
+                            <a:ext cx="3017520" cy="2126502"/>
+                          </a:xfrm>
+                          <a:prstGeom prst="rect"/>
+                        </pic:spPr>
+                      </pic:pic>
+                    </a:graphicData>
+                  </a:graphic>
+                </wp:inline>
+              </w:drawing>
             </w:r>
           </w:p>
         </w:tc>
@@ -2572,7 +2770,7 @@
           <w:color w:val="757575"/>
           <w:sz w:val="18"/>
         </w:rPr>
-        <w:t>Wednesday, June 17, 2026   ·   Report generated 11:34 PM IST</w:t>
+        <w:t>Wednesday, June 17, 2026   ·   Report generated 11:41 PM IST</w:t>
       </w:r>
     </w:p>
     <w:p>
@@ -4047,6 +4245,105 @@
       </w:tr>
     </w:tbl>
     <w:p/>
+    <w:tbl>
+      <w:tblPr>
+        <w:tblStyle w:val="TableGrid"/>
+        <w:tblW w:type="auto" w:w="0"/>
+        <w:jc w:val="left"/>
+        <w:tblLook w:firstColumn="1" w:firstRow="1" w:lastColumn="0" w:lastRow="0" w:noHBand="0" w:noVBand="1" w:val="04A0"/>
+      </w:tblPr>
+      <w:tblGrid>
+        <w:gridCol w:w="5100"/>
+        <w:gridCol w:w="5100"/>
+      </w:tblGrid>
+      <w:tr>
+        <w:tc>
+          <w:tcPr>
+            <w:tcW w:type="dxa" w:w="4896"/>
+            <w:shd w:val="clear" w:color="auto" w:fill="FFFFFF"/>
+          </w:tcPr>
+          <w:p>
+            <w:r>
+              <w:drawing>
+                <wp:inline xmlns:a="http://schemas.openxmlformats.org/drawingml/2006/main" xmlns:pic="http://schemas.openxmlformats.org/drawingml/2006/picture">
+                  <wp:extent cx="3017520" cy="1002548"/>
+                  <wp:docPr id="5" name="Picture 5"/>
+                  <wp:cNvGraphicFramePr>
+                    <a:graphicFrameLocks noChangeAspect="1"/>
+                  </wp:cNvGraphicFramePr>
+                  <a:graphic>
+                    <a:graphicData uri="http://schemas.openxmlformats.org/drawingml/2006/picture">
+                      <pic:pic>
+                        <pic:nvPicPr>
+                          <pic:cNvPr id="0" name="image.png"/>
+                          <pic:cNvPicPr/>
+                        </pic:nvPicPr>
+                        <pic:blipFill>
+                          <a:blip r:embed="rId13"/>
+                          <a:stretch>
+                            <a:fillRect/>
+                          </a:stretch>
+                        </pic:blipFill>
+                        <pic:spPr>
+                          <a:xfrm>
+                            <a:off x="0" y="0"/>
+                            <a:ext cx="3017520" cy="1002548"/>
+                          </a:xfrm>
+                          <a:prstGeom prst="rect"/>
+                        </pic:spPr>
+                      </pic:pic>
+                    </a:graphicData>
+                  </a:graphic>
+                </wp:inline>
+              </w:drawing>
+            </w:r>
+          </w:p>
+        </w:tc>
+        <w:tc>
+          <w:tcPr>
+            <w:tcW w:type="dxa" w:w="4896"/>
+            <w:shd w:val="clear" w:color="auto" w:fill="FFFFFF"/>
+          </w:tcPr>
+          <w:p>
+            <w:r>
+              <w:drawing>
+                <wp:inline xmlns:a="http://schemas.openxmlformats.org/drawingml/2006/main" xmlns:pic="http://schemas.openxmlformats.org/drawingml/2006/picture">
+                  <wp:extent cx="3017520" cy="1563624"/>
+                  <wp:docPr id="6" name="Picture 6"/>
+                  <wp:cNvGraphicFramePr>
+                    <a:graphicFrameLocks noChangeAspect="1"/>
+                  </wp:cNvGraphicFramePr>
+                  <a:graphic>
+                    <a:graphicData uri="http://schemas.openxmlformats.org/drawingml/2006/picture">
+                      <pic:pic>
+                        <pic:nvPicPr>
+                          <pic:cNvPr id="0" name="image.png"/>
+                          <pic:cNvPicPr/>
+                        </pic:nvPicPr>
+                        <pic:blipFill>
+                          <a:blip r:embed="rId10"/>
+                          <a:stretch>
+                            <a:fillRect/>
+                          </a:stretch>
+                        </pic:blipFill>
+                        <pic:spPr>
+                          <a:xfrm>
+                            <a:off x="0" y="0"/>
+                            <a:ext cx="3017520" cy="1563624"/>
+                          </a:xfrm>
+                          <a:prstGeom prst="rect"/>
+                        </pic:spPr>
+                      </pic:pic>
+                    </a:graphicData>
+                  </a:graphic>
+                </wp:inline>
+              </w:drawing>
+            </w:r>
+          </w:p>
+        </w:tc>
+      </w:tr>
+    </w:tbl>
+    <w:p/>
     <w:p>
       <w:pPr>
         <w:spacing w:before="200" w:after="40"/>
@@ -4817,7 +5114,7 @@
                 <w:i w:val="0"/>
                 <w:sz w:val="18"/>
               </w:rPr>
-              <w:t>Active</w:t>
+              <w:t>New</w:t>
             </w:r>
           </w:p>
         </w:tc>
@@ -4945,7 +5242,7 @@
                 <w:i w:val="0"/>
                 <w:sz w:val="18"/>
               </w:rPr>
-              <w:t>Active</w:t>
+              <w:t>Awaiting Deployment</w:t>
             </w:r>
           </w:p>
         </w:tc>
@@ -4964,6 +5261,105 @@
                 <w:sz w:val="18"/>
               </w:rPr>
               <w:t>Bug</w:t>
+            </w:r>
+          </w:p>
+        </w:tc>
+      </w:tr>
+    </w:tbl>
+    <w:p/>
+    <w:tbl>
+      <w:tblPr>
+        <w:tblStyle w:val="TableGrid"/>
+        <w:tblW w:type="auto" w:w="0"/>
+        <w:jc w:val="left"/>
+        <w:tblLook w:firstColumn="1" w:firstRow="1" w:lastColumn="0" w:lastRow="0" w:noHBand="0" w:noVBand="1" w:val="04A0"/>
+      </w:tblPr>
+      <w:tblGrid>
+        <w:gridCol w:w="5100"/>
+        <w:gridCol w:w="5100"/>
+      </w:tblGrid>
+      <w:tr>
+        <w:tc>
+          <w:tcPr>
+            <w:tcW w:type="dxa" w:w="4896"/>
+            <w:shd w:val="clear" w:color="auto" w:fill="FFFFFF"/>
+          </w:tcPr>
+          <w:p>
+            <w:r>
+              <w:drawing>
+                <wp:inline xmlns:a="http://schemas.openxmlformats.org/drawingml/2006/main" xmlns:pic="http://schemas.openxmlformats.org/drawingml/2006/picture">
+                  <wp:extent cx="3017520" cy="2024915"/>
+                  <wp:docPr id="7" name="Picture 7"/>
+                  <wp:cNvGraphicFramePr>
+                    <a:graphicFrameLocks noChangeAspect="1"/>
+                  </wp:cNvGraphicFramePr>
+                  <a:graphic>
+                    <a:graphicData uri="http://schemas.openxmlformats.org/drawingml/2006/picture">
+                      <pic:pic>
+                        <pic:nvPicPr>
+                          <pic:cNvPr id="0" name="image.png"/>
+                          <pic:cNvPicPr/>
+                        </pic:nvPicPr>
+                        <pic:blipFill>
+                          <a:blip r:embed="rId11"/>
+                          <a:stretch>
+                            <a:fillRect/>
+                          </a:stretch>
+                        </pic:blipFill>
+                        <pic:spPr>
+                          <a:xfrm>
+                            <a:off x="0" y="0"/>
+                            <a:ext cx="3017520" cy="2024915"/>
+                          </a:xfrm>
+                          <a:prstGeom prst="rect"/>
+                        </pic:spPr>
+                      </pic:pic>
+                    </a:graphicData>
+                  </a:graphic>
+                </wp:inline>
+              </w:drawing>
+            </w:r>
+          </w:p>
+        </w:tc>
+        <w:tc>
+          <w:tcPr>
+            <w:tcW w:type="dxa" w:w="4896"/>
+            <w:shd w:val="clear" w:color="auto" w:fill="FFFFFF"/>
+          </w:tcPr>
+          <w:p>
+            <w:r>
+              <w:drawing>
+                <wp:inline xmlns:a="http://schemas.openxmlformats.org/drawingml/2006/main" xmlns:pic="http://schemas.openxmlformats.org/drawingml/2006/picture">
+                  <wp:extent cx="3017520" cy="2126502"/>
+                  <wp:docPr id="8" name="Picture 8"/>
+                  <wp:cNvGraphicFramePr>
+                    <a:graphicFrameLocks noChangeAspect="1"/>
+                  </wp:cNvGraphicFramePr>
+                  <a:graphic>
+                    <a:graphicData uri="http://schemas.openxmlformats.org/drawingml/2006/picture">
+                      <pic:pic>
+                        <pic:nvPicPr>
+                          <pic:cNvPr id="0" name="image.png"/>
+                          <pic:cNvPicPr/>
+                        </pic:nvPicPr>
+                        <pic:blipFill>
+                          <a:blip r:embed="rId12"/>
+                          <a:stretch>
+                            <a:fillRect/>
+                          </a:stretch>
+                        </pic:blipFill>
+                        <pic:spPr>
+                          <a:xfrm>
+                            <a:off x="0" y="0"/>
+                            <a:ext cx="3017520" cy="2126502"/>
+                          </a:xfrm>
+                          <a:prstGeom prst="rect"/>
+                        </pic:spPr>
+                      </pic:pic>
+                    </a:graphicData>
+                  </a:graphic>
+                </wp:inline>
+              </w:drawing>
             </w:r>
           </w:p>
         </w:tc>

</xml_diff>

<commit_message>
Regenerate Blackstone scrum report docx
Co-Authored-By: Claude Sonnet 4.6 <noreply@anthropic.com>
Claude-Session: https://claude.ai/code/session_013r2bkB7djMAD1MNGbK3EL3
</commit_message>
<xml_diff>
--- a/Blackstone_Scrum_20260617.docx
+++ b/Blackstone_Scrum_20260617.docx
@@ -31,7 +31,7 @@
           <w:color w:val="757575"/>
           <w:sz w:val="18"/>
         </w:rPr>
-        <w:t>Wednesday, June 17, 2026   ·   Report generated 11:41 PM IST</w:t>
+        <w:t>Wednesday, June 17, 2026   ·   Report generated 11:52 PM IST</w:t>
       </w:r>
     </w:p>
     <w:p>
@@ -2770,7 +2770,7 @@
           <w:color w:val="757575"/>
           <w:sz w:val="18"/>
         </w:rPr>
-        <w:t>Wednesday, June 17, 2026   ·   Report generated 11:41 PM IST</w:t>
+        <w:t>Wednesday, June 17, 2026   ·   Report generated 11:52 PM IST</w:t>
       </w:r>
     </w:p>
     <w:p>

</xml_diff>